<commit_message>
algo update and results
</commit_message>
<xml_diff>
--- a/sequence-matching/output/test_data12_orna_new.docx
+++ b/sequence-matching/output/test_data12_orna_new.docx
@@ -189,7 +189,7 @@
           </w:tcPr>
           <w:p>
             <w:r>
-              <w:t>snang ba dang / shes rab dri ma med pa'i khyad par du byas pa'i blos rtogs pa'o// de yang so sor rtogs pa'i shes rab dang / rnam par mi rtog pa'i shes rab bo</w:t>
+              <w:t>so sor rtogs pa'i shes rab dang / rnam par mi rtog pa'i shes rab bo</w:t>
             </w:r>
           </w:p>
         </w:tc>
@@ -199,9 +199,7 @@
           </w:tcPr>
           <w:p>
             <w:r>
-              <w:t>srang</w:t>
-              <w:br/>
-              <w:t>lta bu ni shes rab dri ma med pas rtogs pa yin no/ /shes rab kyang gnyis te so sor rtog</w:t>
+              <w:t>so sor rtog</w:t>
               <w:br/>
               <w:t>pa'i shes rab dang / rnam par mi rtog pa'i shes rab bo</w:t>
             </w:r>
@@ -261,7 +259,7 @@
           </w:tcPr>
           <w:p>
             <w:r>
-              <w:t>sdom la gnas pa ni// ji ltar tshul tsam rnam dag pa// 'dod pa'i g.yeng ba med byed cing // 'gyod pa'i dri ma med pa yis// rtag tu dbang po sdom pa'i phyir// ting 'dzin thob pa'i rgyu yin ltar// so sor spang ba zhes bya 'di// yid dang dbang po bsgoms nas ni// rnam par shes pa skye ba kun// thams cad skyon du byas nas ni// spang bar bya ba'ang ma yin la// dngos por bltas te mtshan ma yi// rjes su 'brang ba'ang ma yin la// spyod yul cir snang thams cad kun// rtag tu rang gi lha nyid du// bdag nyid bltas te sbyang bar bya// dang por gzhan pa ka dag gnyis// spang bar bya ba 'di dag ni// dbang po rang bzhin gyis bsdams shing // 'dod pa bkag pa'i gdung bas kyang // ting nge 'dzin ni ma zin pa// rgyal ba'i byin rlabs nye 'gyur bas// bsam gtan snod du 'gyur ba yin// 'di ni so sor spyod ces bya// de phyir bde ba longs spyod de// so sor spang ba zhes kyang bya// 'dod pa'i g.yeng bar gyur pa spang // so sor spang ba sdom la gnas pa zhes bya ba'i ting nge 'dzin to// bsam gtan 'brel dang yul du bcas// dmigs par bya ba'i yan lag can// bsam gtan gyis ni 'dod pa dang // sdig to mi dge ba yi chos// dben pa dag las de skyed yin// 'di yi phyir na de'i 'og tu// bsam gtan bstan pa rigs pas bshad// bsam gtan yul ni sku gsung thugs// gsang ba gsum la yul du bya// de la sku yi gsang ba ni// lha yi phyag rgya gzugs kyi sku// kha dog dbyibs dang g.yo ba yi// smin ma mig dang so dang mchu// bzhin dang lus dang yan lag gis// pad+ma dbang chen dpal gyi rgya// rang don las rnams grub byed pa'o// de ni sku yi tshul rnams kyi// sgo nas bsam gtan yul du dmigs// de la gsung gi gsang ba ni// sgra dang sgra min rnam bcad pa// nga ro sbas pa rdo rje'i gsung // lha yi thugs la ljags steng du// chos kyi yi ge kha dog dang // dbyibs kyi mtshan mar bsam pa dang // de yang sgra dang sgra don gyis// chos nyid brtag pa brtag cing dpyad// bsam gtan thob pa'i rgyu yin te// sgra la gnas pa'i bsam gtan ni// rnal 'byor thob par bya ba yin// sgra yi mtha' la gnas pa ni// bsam gtan thar pa ster bar byed// ngag gi sgra grag byed pa ni// bsam gtan gtso bor bshad pa yis// skabs 'dir g.yeng ba'i rgyur 'gyur ro// de la thugs kyi gsang ba ni// thugs kar sems dpa' rdo rje bsgom// ye shes sems dpa' bsgom pa ni// de ni thugs kyi mtshan ma la// de yi don ni byang chub sems// chos kyi sku ru gnas pa yis// mtshan ma rnam par bcad pa ni// thugs kyi bdag nyid de yin te// de ltar gsal ba gsum dmigs pa/ bsam gtan bya ba'i yul yin no// gsang ba gsum gyis thams cad bsdus// phyag rgya yongs su dag pa yi// lha rnams don dang rtags tshul bsdus// bsam gtan yan lag rnam pa lnga// rtog dpyod gnyis dang dga' bde gnyis// sems ni rtse gcig pa dang lnga// yan lag tshul gyis dmigs par byed// gsang ba gsum gyi mtshan nyid la// ji lta ba bzhin rtogs pa'i blo// de la rtogs nas skye ba'o// de la spyod par byed pa ni// de nyid la ni blo nyid kyis// yang dang yang du sbyor bya zhing // de yi don dang bcas pa la// zhib tu dpyod pa yang nas yang // spyod par byed cing 'jug pa'o// de la dga' bar bya ba ni// rtog dpyod gnyis kyi bsam gtan las// thob pas gsang ba gsum po yi// 'dra snang rnam par 'byung gyur te// de'i tshe 'dod pas dben gyur pa// sngar ma myong ba'i don nyid ni// myong bas thun mong ma yin pa'i// dga' ba rlabs po cher skye'o// de la bde ba bya ba ni// de dbang sems bsdus thob pa na// lus dang sems kyi bde ba ni// des ni nyams su myong 'gyur ro// de la sems rtse gcig pa ni// de ltar sems kyis bsdus 'gyur las// shes pa dang ni shes bya yang // gnyis su snang bar mi skye ste// rang rig tsam du 'gyur ba'o</w:t>
+              <w:t>ig sdom la gnas pa ni// ji ltar tshul tsam rnam dag pa// 'dod pa'i g.yeng ba med byed cing // 'gyod pa'i dri ma med pa yis// rtag tu dbang po sdom pa'i phyir// ting 'dzin thob pa'i rgyu yin ltar// so sor spang ba zhes bya 'di// yid dang dbang po bsgoms nas ni// rnam par shes pa skye ba kun// thams cad skyon du byas nas ni// spang bar bya ba'ang ma yin la// dngos por bltas te mtshan ma yi// rjes su 'brang ba'ang ma yin la// spyod yul cir snang thams cad kun// rtag tu rang gi lha nyid du// bdag nyid bltas te sbyang bar bya// dang por gzhan pa ka dag gnyis// spang bar bya ba 'di dag ni// dbang po rang bzhin gyis bsdams shing // 'dod pa bkag pa'i gdung bas kyang // ting nge 'dzin ni ma zin pa// rgyal ba'i byin rlabs nye 'gyur bas// bsam gtan snod du 'gyur ba yin// 'di ni so sor spyod ces bya// de phyir bde ba longs spyod de// so sor spang ba zhes kyang bya// 'dod pa'i g.yeng bar gyur pa spang // so sor spang ba sdom la gnas pa zhes bya ba'i ting nge 'dzin to// bsam gtan 'brel dang yul du bcas// dmigs par bya ba'i yan lag can// bsam gtan gyis ni 'dod pa dang // sdig to mi dge ba yi chos// dben pa dag las de skyed yin// 'di yi phyir na de'i 'og tu// bsam gtan bstan pa rigs pas bshad// bsam gtan yul ni sku gsung thugs// gsang ba gsum la yul du bya// de la sku yi gsang ba ni// lha yi phyag rgya gzugs kyi sku// kha dog dbyibs dang g.yo ba yi// smin ma mig dang so dang mchu// bzhin dang lus dang yan lag gis// pad+ma dbang chen dpal gyi rgya// rang don las rnams grub byed pa'o// de ni sku yi tshul rnams kyi// sgo nas bsam gtan yul du dmigs// de la gsung gi gsang ba ni// sgra dang sgra min rnam bcad pa// nga ro sbas pa rdo rje'i gsung // lha yi thugs la ljags steng du// chos kyi yi ge kha dog dang // dbyibs kyi mtshan mar bsam pa dang // de yang sgra dang sgra don gyis// chos nyid brtag pa brtag cing dpyad// bsam gtan thob pa'i rgyu yin te// sgra la gnas pa'i bsam gtan ni// rnal 'byor thob par bya ba yin// sgra yi mtha' la gnas pa ni// bsam gtan thar pa ster bar byed// ngag gi sgra grag byed pa ni// bsam gtan gtso bor bshad pa yis// skabs 'dir g.yeng ba'i rgyur 'gyur ro// de la thugs kyi gsang ba ni// thugs kar sems dpa' rdo rje bsgom// ye shes sems dpa' bsgom pa ni// de ni thugs kyi mtshan ma la// de yi don ni byang chub sems// chos kyi sku ru gnas pa yis// mtshan ma rnam par bcad pa ni// thugs kyi bdag nyid de yin te// de ltar gsal ba gsum dmigs pa/ bsam gtan bya ba'i yul yin no// gsang ba gsum gyis thams cad bsdus// phyag rgya yongs su dag pa yi// lha rnams don dang rtags tshul bsdus// bsam gtan yan lag rnam pa lnga// rtog dpyod gnyis dang dga' bde gnyis// sems ni rtse gcig pa dang lnga// yan lag tshul gyis dmigs par byed// gsang ba gsum gyi mtshan nyid la// ji lta ba bzhin rtogs pa'i blo// de la rtogs nas skye ba'o// de la spyod par byed pa ni// de nyid la ni blo nyid kyis// yang dang yang du sbyor bya zhing // de yi don dang bcas pa la// zhib tu dpyod pa yang nas yang // spyod par byed cing 'jug pa'o// de la dga' bar bya ba ni// rtog dpyod gnyis kyi bsam gtan las// thob pas gsang ba gsum po yi// 'dra snang rnam par 'byung gyur te// de'i tshe 'dod pas dben gyur pa// sngar ma myong ba'i don nyid ni// myong bas thun mong ma yin pa'i// dga' ba rlabs po cher skye'o// de la bde ba bya ba ni// de dbang sems bsdus thob pa na// lus dang sems kyi bde ba ni// des ni nyams su myong 'gyur ro// de la sems rtse gcig pa ni// de ltar sems kyis bsdus 'gyur las// shes pa dang ni shes bya yang // gnyis su snang bar mi skye ste// rang rig tsam du 'gyur ba'o</w:t>
             </w:r>
           </w:p>
         </w:tc>
@@ -271,7 +269,7 @@
           </w:tcPr>
           <w:p>
             <w:r>
-              <w:t>sdom pa la gnas pa yin te/ ji ltar tshul</w:t>
+              <w:t>i sdom pa la gnas pa yin te/ ji ltar tshul</w:t>
               <w:br/>
               <w:t>khrims rnam par dag pa 'dod pas g.yeng ba med cing 'gyod pa'i dri ma med pas rtag du</w:t>
               <w:br/>
@@ -477,7 +475,7 @@
           </w:tcPr>
           <w:p>
             <w:r>
-              <w:t>dbugs// nang du gzugs la bslab par bya// de nas yang ni dbugs zin te// sems kyang shin tu zhi bar 'gyur// brtan pa thob par gyur pas ni// mtshan ma rnam lnga 'byung bar 'gyur// dang po smig rgyu 'dra ba dang // gnyis pa la ni du ba'i tshul// gsum pa srin bu me khyer 'dra// bzhi pa mar me bzhin du 'bar// lnga pa rtags su snang ba ni// sprin med pa yi nam mkha' bzhin</w:t>
+              <w:t>dul zhing // dbugs zhi brtan par gyur pa dang // rtogs dang ldan par bya ba'i phyir// gcig tu ma nges rgyu ba'i dbugs// nang du gzugs la bslab par bya// de nas yang ni dbugs zin te// sems kyang shin tu zhi bar 'gyur// brtan pa thob par gyur pas ni// mtshan ma rnam lnga 'byung bar 'gyur// dang po smig rgyu 'dra ba dang // gnyis pa la ni du ba'i tshul// gsum pa srin bu me khyer 'dra// bzhi pa mar me bzhin du 'bar// lnga pa rtags su snang ba ni// sprin med pa yi nam mkha' bzhin</w:t>
             </w:r>
           </w:p>
         </w:tc>
@@ -487,7 +485,9 @@
           </w:tcPr>
           <w:p>
             <w:r>
-              <w:t>dbugs nang du gzung</w:t>
+              <w:t>dul zhing</w:t>
+              <w:br/>
+              <w:t>dbugs zhi nas/ brtan zhing stobs dang ldan par bya ba'i phyir/ dbugs nang du gzung</w:t>
               <w:br/>
               <w:t>ba la bslab par bya'o/ /de nas dbugs zin te sems kyang shin du zhi bar gyur nas brtan</w:t>
               <w:br/>
@@ -631,7 +631,7 @@
           </w:tcPr>
           <w:p>
             <w:r>
-              <w:t>n gnas dang yul dang las// dmigs pa'i thabs dang yon tan yin// de la dbugs kyi rang bzhin ni// lus nyid khams lnga'i rang bzhin gnas// dbugs kyi rang bzhin khams lnga yin// sa chu me rlung nam mkha' 'byed// sa yi dbugs ni sra zhing lci// chu yi dbugs ni dal zhing 'joms// me yi dbugs ni 'bar zhing dro// rlung gi dbugs ni yang zhing rtsub// mkha' ni 'phyo zhing rgyu mi tshor// dbugs kyi gnas ni lus nyid la// snying ni khong stong na dag dang // glo ba khong stong nang dag gnas// dbugs kyi rlung ni nang du yang // lus kun la yang khyab par gyur// shas cher lte ba yan chad kun// phyi rol sor ni bcu drug pa// tshun chad rgyu bar byed pa yin// mdor bsdus nang du bsdus 'dus kyang mi shes// dbugs kyi lam ni kun khyab kyang // gtso bo mgrin pa gsang gnas nas// sna yi bu gar byung ba'o// dbugs kyi lam ni rnam gnyis te// 'dzin pa'i las dang phyed pa'i las// de la 'dzin pa'i las byed ni// reg pas lus la phan 'dogs shing // lus kyang 'dzin par byed pa dang // sems kyi 'dzin kyang dbugs kyi byed// sems kyang 'dzin par byed pa dang // lus sems gnyis ka 'dzin pas na// srog 'dzin pa yi las byed do// byed pa'i las ni g.yo ba'i tshe// lus sems gnyis ka g.yo bar byed// dbugs la dmigs pa'i thabs sgo mang // phyi la 'gro na gtang bar bya// nang du 'gro na dgang par byed// khong du gnas na gzhag par bya// gang ltar dmigs kyang 'gal ba med// thams cad gdams ngag gnad yin no// de dag mdor bsdus rnam pa gnyis// dbugs kyi sgo dang mthun dmigs dang // chos la ma brten dmigs pa'o// de la mthun par dmigs pa ni// g.yas nas rgyu bar byed pa ni// de ni me dang rung gi khams// g.yon nas rgyu ba sa chu'i khams// dbus nas rgyu ba nam mkha'i khams// de las phye na g.yas dang g.yon// re re la yang khams lnga'o// lnga lnga tshang bar rgyu ba dang // rags rim mdo ru bsdus pa dang // g.yas g.yon re re dag la yang // 'byung ba re re'i cha shas su// brtan pa dag gi sgo nas ni// kha dog dbyibs dang bong tshod dang // rnam pa'i sgo nas so sor phye// de la dmigs pa</w:t>
+              <w:t>n gnas dang yul dang las// dmigs pa'i thabs dang yon tan yin// de la dbugs kyi rang bzhin ni// lus nyid khams lnga'i rang bzhin gnas// dbugs kyi rang bzhin khams lnga yin// sa chu me rlung nam mkha' 'byed// sa yi dbugs ni sra zhing lci// chu yi dbugs ni dal zhing 'joms// me yi dbugs ni 'bar zhing dro// rlung gi dbugs ni yang zhing rtsub// mkha' ni 'phyo zhing rgyu mi tshor// dbugs kyi gnas ni lus nyid la// snying ni khong stong na dag dang // glo ba khong stong nang dag gnas// dbugs kyi rlung ni nang du yang // lus kun la yang khyab par gyur// shas cher lte ba yan chad kun// phyi rol sor ni bcu drug pa// tshun chad rgyu bar byed pa yin// mdor bsdus nang du bsdus 'dus kyang mi shes// dbugs kyi lam ni kun khyab kyang // gtso bo mgrin pa gsang gnas nas// sna yi bu gar byung ba'o// dbugs kyi lam ni rnam gnyis te// 'dzin pa'i las dang phyed pa'i las// de la 'dzin pa'i las byed ni// reg pas lus la phan 'dogs shing // lus kyang 'dzin par byed pa dang // sems kyi 'dzin kyang dbugs kyi byed// sems kyang 'dzin par byed pa dang // lus sems gnyis ka 'dzin pas na// srog 'dzin pa yi las byed do// byed pa'i las ni g.yo ba'i tshe// lus sems gnyis ka g.yo bar byed// dbugs la dmigs pa'i thabs sgo mang // phyi la 'gro na gtang bar bya// nang du 'gro na dgang par byed// khong du gnas na gzhag par bya// gang ltar dmigs kyang 'gal ba med// thams cad gdams ngag gnad yin no// de dag mdor bsdus rnam pa gnyis// dbugs kyi sgo dang mthun dmigs dang // chos la ma brten dmigs pa'o// de la mthun par dmigs pa ni// g.yas nas rgyu bar byed pa ni// de ni me dang rung gi khams// g.yon nas rgyu ba sa chu'i khams// dbus nas rgyu ba nam mkha'i khams// de las phye na g.yas dang g.yon// re re la yang khams lnga'o// lnga lnga tshang bar rgyu ba dang // rags rim mdo ru bsdus pa dang // g.yas g.yon re re dag la yang // 'byung ba re re'i cha shas su// brtan pa dag gi sgo nas ni// kha dog dbyibs dang bong tshod dang // rnam pa'i sgo nas so sor phye// de la dmigs par bya ba'o// sa ser chu dkar me ni dmar// rlung ni ljang ser nam mkha' mthing // de ni rgyu ba tha mar rgyu// gru bzhi zlum po gru gsum dang // zla gam spros bral chos 'byung dang // gtso bo che la 'khor rnam phra// goms nas chen po phra bar snang // grangs dang rnam pa nges pa ni// dmigs pa brtan par 'byongs nas gsal// rnam pa'i 'od dang yi ge dang // mtshan ma dang ni phra mo'i sku// de lta bu yi rnam par dmigs// chos la ma brtan par dmigs la// bye brag so sor dbye ba med// dbugs ni phyi nang rgyu tsam dmigs// mtshan ma'i rnam pa gang yang rung // gcig la dmigs par bya ba'am// reg bya tsam la dmigs kyang rung // sems ma yengs par gtad pa ni// sems zin 'ba' zhig tsam gyis mtshon// spyi ru grags pa'i kha dog dang // bongs tshod skyon dang yon tan dang // khams rnams gdug pa'i mtshan nyid pas// brtan ni yul du dmigs pa tsam// mthu brtas dus ngan skyon yon yod// de la kha dog dkar po ni// gdug pa zhi byed mtshan nyid la// ser po gdug pa 'dzin pa'i mtshan// dmar po gdug pa mched mtshan nyid// nag po gdug pa'i slong ba'i mtshan// mtshan nyid de ltar byed pa'o// reg bya dang ni bongs tshod dang // sra zhing sbom pa ltar snang ba// lus la mi bde ba dag 'byung // phra zhing drangs pa chu zla ltar// rdos pa'i sha chung dmigs pa na// lus la mi bde mi 'byung ngongo// dbugs la dmigs pa'i yon tan ni// lus kyi rnam pa la mkhas pas// gcig phur blta dang dngos por blta// bden zhing gtsang mar blta rnams bzlog/ lhag mthong don yang bskyed pa'o// sems la gnas pa thob pas ni// zhig nas las su rung gyur pa// rang bzhin gnas yul lam dang las// dmigs pa'i thabs dang yon tan no// sems la dmigs pa'i rang bzhin ni// snang ba'i khams la dmigs pa dang // rlom sems pa yi khams dang ni// dngos po so sor rnam rig mkhas// sems kyi gnas ni sa chu me rlung mkha'i// khams lnga'i rlung la zhon nas su// khams lnga'i lus la gnas pa'o// sems kyi yul ni rnam rig pa// snang ba'i yul ni chos rnams la// rlom sems yul na sems nyid do// rnam par rig par bya ba'i yul// de ni phyi yi skye mched rnams// sems nyid lam ni dbang po rnams// sems kyi las gnyis 'dzin byed ni// 'dzin pa'i las kyis chos rnams 'dzin// byed pa'i las ni dkar nag gi/ 'du byed thams cad ma lus pa// mngon par 'du ni byed pa'o// sems la dmigs pa'i thabs dag ni// dbugs la dmigs pa la rung nas// de nas dran dang shes bzhin gzung // sems ni ji ltar bskyed nyid dmigs// sems kyi mtshan nyid khong chud 'gyur// sems la dmigs pa'i yon tan ni// bdag tu blta dang rtags par blta/ dngos por blta ba thams cad bzlog/ lhag mthong bskyed par byed pa'o// sems nyid las su rung 'gyur te// de yis zhi gnas thob pa'o// lus sems dmigs pa las rung nas// lha dang dmigs par byed pa ni// rang bzhin gnas yul lam dang bcas// dmigs thabs yon tan rim pa dang // dang por bar tha sgom tshad mod// de la lha yi rang bzhin ni// chos nyid rnam par dag pa dang // rnam par mi rtog ye shes dang // cir yang sa le mkhyen pa yis// ye shes 'gro 'dul gzugs kyi sku// so so'i skad du dam pa'i chos// ston pa'i gsung de chos rnga yin// lha yi gnas ni sems can gyis// lus dang sems la gnas pa nyid// lha yi yul ni chos kyi dbyings// thugs rje'i zhing rnams gnas pa'o// lha yi lam ni gang yin pa// 'gro dang 'ong ba mi mnga' yang // lha yongs bzung ba'i sems can ni// sems can skyabs ni lha yin te// 'brel gnyis sgo nas lam gyur pa// lam gyi chos dang lung gi chos// lha yi lam du gyur pa'o// lha yi las ni 'dzin par byed// 'dzin pa'i las ni yon tan ni// thams cad kun dang ldan pa'o// byed pa'i las ni sems can rnams// thams cad grol bar mdzad pa'o// lha la dmigs par byed pa'i thabs// lus dang sems nyid ltar bsgom pas// de la rnal 'byor rnam gsum gyi// tshul gyis byin gyis brlab tshul lam// de nyid yongs su rtag pa'am// rdzogs tshul gang yang rung bar bsgom// lha yi yon tan rnam gnyis tshogs// dus gcig rdzogs par gyur pa'o// de ltar dmigs pa rnam gsum la// rim gyis bslab cing rim gyis brten// 'di ni phyis pa dang po ru// zhugs pa tsam du dngos su ni// lus nyid sems kyi rnam pa yin// sems kyi rang bzhin lha nyid yin// de bas phyi nang snod bcud kyi// chos rnams ma lus thams cad kun// rang gi ngo bo lha nyid shes// dang po lha ngo shes pa yin// bar du lha bsgom thabs shes pa// sgrub thabs sna tshogs gsungs pa dang // bsam gtan lus dang sems don gyis// bcos pa'i thabs rnams bstan pa yin// tha ma las su rung ba'i tshad// mtshan ma med pa'i lha tshad ni// byang chub sems la lha ru bzhag/ mtshan ma lha yi sku bsgom tshad// lhang nge lhan nineni lham me gsum// lham me ba ni ma rdos pa// lhan ne ba ni ma g.yos pa// lhang nge ba ni ma bsgribs pa// ma rdos snang la rang bzhin med// gzugs brnyan chu zla lta bu'o// ma g.yos pa ni bying rgod kyi// zug rdu ma skyes pa yin te// nor bu rin chen 'od lta bu// ma bsgribs de gnyis dang ldan pas// ma rtogs pa yi sgrib pa dang // mi gsal ba yi sgrib pa gnyis// med par shin tu gsal bar snang // dbang pos blta bar mi bzod ltar// lha sku shin tu gsal ba'o// tshul bzhin byed par ma nus na// bzlas brjod lha yi de kho nas// lhar grags lhun grub sems can khengs// rang la gnas pa de rtogs yin// tshul bzhin slob bar 'dod pa yis// de dag rnams kyis tshul du spyod// gang dag tshul bzhin byed ma nus// mos dang bya bas g.yeng 'gyur zhing // tshul bzhin sbyor bar mi nus rnams// brda' don lha yi ting 'dzin ni// ji ltar yin pa yid la bya// des zin cho ga rim gyis bskyed// skad cig gcig la rdzogs tshul lam// bag chags shugs sam mos pa dang // nga rgyal dag gi sgo nas kyang // ma yengs pa yi sems kyis gzung // bzlas brjod bya zhing bsam gtan 'jug/ bzlas brjod byed pa'i tshe na yang // lha ni mi bsam ma dmigs rung // las sam 'bras bu gang dmigs kyang // spyir na dmigs pa rtse gcig la// 'bad pas mthu dang byin rlabs che// spyir na lha yi de kho na// nyid las 'grub pa'i lha yang 'grub// don dam sems kyi lha dang ni// kun rdzob mtshan ma'i lha nyid la// sems dpa' bye brag lha zhes bya// ming du lhar ni btags pa yin// dam tshig can gyi skye bo'i lha// phyag rgya'i mtshan ma lhar grags pa// btags pas rnam pa du mar 'jug/ rnam par smin pa'i lus dbyibs kyis/ bye brag dpe phyi zhes pa dang // de nyid bdag gi chen po'o// mtshan ma'i gzugs zhes btags pa dang // de nyid skye bo'i byin rlabs sogs// nus mthu can zhes btags pa dang // de nyid rnam par smin pa'i gzugs// bye brag ye shes byin brlabs nyid// dbyer med 'dres nas lha zhes btags// de nyid bdag nyid chen po rnam// thugs ni gsang ba'i ye shes nyid// mtshan ma'i gzugs su sprul pa ste// chu nyid grang ba'i rkyen gyis ni// 'khrugs rom gyur pa lta bu'o// chos rnams lhun gyis grub pa yi// phyag rgya'i rang bzhin yin pa la// las kyi 'phro dang skal ba yi// dbang gis so sor snang ba de// shin tu dag par 'dul gyur rnams// longs spyod rdzogs pa'i skur snang ngo // sems can khengs pa dag la yang // las ni dag par gyur rnams la// sbrul sku rab byung cha lugs snang // de yi 'og ma rnams la ni// cha shas dag gis phyag rgyar snang // de yi 'og ma rnams la ni// thun mong gzugs brnyan la brten pa'i// phyag rgya tha dad snang bas te// thams cad lhun gyis grub pa la// phyag rgya'i bye brag med par 'dod// de lta</w:t>
             </w:r>
           </w:p>
         </w:tc>
@@ -835,197 +835,9 @@
               <w:br/>
               <w:t>/ /de'i 'og ma rnams la ni cha shas kyi phyag rgya snang ngo / /de'i 'og ma rnams la ni</w:t>
               <w:br/>
-              <w:t>thun mong gi gzugs la rten pa'i phyag rgya sna</w:t>
-            </w:r>
-          </w:p>
-        </w:tc>
-      </w:tr>
-      <w:tr>
-        <w:tc>
-          <w:tcPr>
-            <w:tcW w:type="dxa" w:w="864"/>
-          </w:tcPr>
-          <w:p>
-            <w:r>
-              <w:t>12</w:t>
-            </w:r>
-          </w:p>
-        </w:tc>
-        <w:tc>
-          <w:tcPr>
-            <w:tcW w:type="dxa" w:w="4320"/>
-          </w:tcPr>
-          <w:p>
-            <w:r>
-              <w:t>gsal// rnam pa'i 'od dang yi ge dang // mtshan ma dang ni phra mo'i sku// de lta bu yi rnam par dmigs// chos la ma brtan par dmigs la// bye brag so sor dbye ba med// dbugs ni phyi nang rgyu tsam dmigs// mtshan ma'i rnam pa gang yang rung // gcig la dmigs par bya ba'am// reg bya tsam la dmigs kyang rung // sems ma yengs par gtad pa ni// sems zin 'ba' zhig tsam gyis mtshon// spyi ru grags pa'i kha dog dang // bongs tshod skyon dang yon tan dang // khams rnams gdug pa'i mtshan nyid pas// brtan ni yul du dmigs pa tsam// mthu brtas dus ngan skyon yon yod// de la kha dog dkar po ni// gdug pa zhi byed mtshan nyid la// ser po gdug pa 'dzin pa'i mtshan// dmar po gdug pa mched mtshan nyid// nag po gdug pa'i slong ba'i mtshan// mtshan nyid de ltar byed pa'o// reg bya dang ni bongs tshod dang // sra zhing sbom pa ltar snang ba// lus la mi bde ba dag 'byung // phra zhing drangs pa chu zla ltar// rdos pa'i sha chung dmigs pa na// lus la mi bde mi 'byung ngongo// dbugs la dmigs pa'i yon tan ni// lus kyi rnam pa la mkhas pas// gcig phur blta dang dngos por blta// bden zhing gtsang mar blta rnams bzlog/ lhag mthong don yang bskyed pa'o// sems la gnas pa thob pas ni// zhig nas las su rung gyur pa// rang bzhin gnas yul lam dang las// dmigs pa'i thabs dang yon tan no// sems la dmigs pa'i rang bzhin ni// snang ba'i khams la dmigs pa dang // rlom sems pa yi khams dang ni// dngos po so sor rnam rig mkhas// sems kyi gnas ni sa chu me rlung mkha'i// khams lnga'i rlung la zhon nas su// khams lnga'i lus la gnas pa'o// sems kyi yul ni rnam rig pa// snang ba'i yul ni chos rnams la// rlom sems yul na sems nyid do// rnam par rig par bya ba'i yul// de ni phyi yi skye mched rnams// sems nyid lam ni dbang po rnams// sems kyi las gnyis 'dzin byed ni// 'dzin pa'i las kyis chos rnams 'dzin// byed pa'i las ni dkar nag gi/ 'du byed thams cad ma lus pa// mngon par 'du ni byed pa'o// sems la dmigs pa'i thabs dag ni// dbugs la dmigs pa la rung nas// de nas dran dang shes bzhin gzung // sems ni ji ltar bskyed nyid dmigs// sems kyi mtshan nyid khong chud 'gyur// sems la dmigs pa'i yon tan ni// bdag tu blta dang rtags par blta/ dngos por blta ba thams cad bzlog/ lhag mthong bskyed par byed pa'o// sems nyid las su rung 'gyur te// de yis zhi gnas thob pa'o// lus sems dmigs pa las rung nas// lha dang dmigs par byed pa ni// rang bzhin gnas yul lam dang bcas// dmigs thabs yon tan rim pa dang // dang por bar tha sgom tshad mod// de la lha yi rang bzhin ni// chos nyid rnam par dag pa dang // rnam par mi rtog ye shes dang // cir yang sa le mkhyen pa yis// ye shes 'gro 'dul gzugs kyi sku// so so'i skad du dam pa'i chos// ston pa'i gsung de chos rnga yin// lha yi gnas ni sems can gyis// lus dang sems la gnas pa nyid// lha yi yul ni chos kyi dbyings// thugs rje'i zhing rnams gnas pa'o// lha yi lam ni gang yin pa// 'gro dang 'ong ba mi mnga' yang // lha yongs bzung ba'i sems can ni// sems can skyabs ni lha yin te// 'brel gnyis sgo nas lam gyur pa// lam gyi chos dang lung gi chos// lha yi lam du gyur pa'o// lha yi las ni 'dzin par byed// 'dzin pa'i las ni yon tan ni// thams cad kun dang ldan pa'o// byed pa'i las ni sems can rnams// thams cad grol bar mdzad pa'o// lha la dmigs par byed pa'i thabs// lus dang sems nyid ltar bsgom pas// de la rnal 'byor rnam gsum gyi// tshul gyis byin gyis brlab tshul lam// de nyid yongs su rtag pa'am// rdzogs tshul gang yang rung bar bsgom// lha yi yon tan rnam gnyis tshogs// dus gcig rdzogs par gyur pa'o// de ltar dmigs pa rnam gsum la// rim gyis bslab cing rim gyis brten// 'di ni phyis pa dang po ru// zhugs pa tsam du dngos su ni// lus nyid sems kyi rnam pa yin// sems kyi rang bzhin lha nyid yin// de bas phyi nang snod bcud kyi// chos rnams ma lus thams cad kun// rang gi ngo bo lha nyid shes// dang po lha ngo shes pa yin// bar du lha bsgom thabs shes pa// sgrub thabs sna tshogs gsungs pa dang // bsam gtan lus dang sems don gyis// bcos pa'i thabs rnams bstan pa yin// tha ma las su rung ba'i tshad// mtshan ma med pa'i lha tshad ni// byang chub sems la lha ru bzhag/ mtshan ma lha yi sku bsgom tshad// lhang nge lhan nineni lham me gsum// lham me ba ni ma rdos pa// lhan ne ba ni ma g.yos pa// lhang nge ba ni ma bsgribs pa// ma rdos snang la rang bzhin med// gzugs brnyan chu zla lta bu'o// ma g.yos pa ni bying rgod kyi// zug rdu ma skyes pa yin te// nor bu rin chen 'od lta bu// ma bsgribs de gnyis dang ldan pas// ma rtogs pa yi sgrib pa dang // mi gsal ba yi sgrib pa gnyis// med par shin tu gsal bar snang // dbang pos blta bar mi bzod ltar// lha sku shin tu gsal ba'o// tshul bzhin byed par ma nus na// bzlas brjod lha yi de kho nas// lhar grags lhun grub sems can khengs// rang la gnas pa de rtogs yin// tshul bzhin slob bar 'dod pa yis// de dag rnams kyis tshul du spyod// gang dag tshul bzhin byed ma nus// mos dang bya bas g.yeng 'gyur zhing // tshul bzhin sbyor bar mi nus rnams// brda' don lha yi ting 'dzin ni// ji ltar yin pa yid la bya// des zin cho ga rim gyis bskyed// skad cig gcig la rdzogs tshul lam// bag chags shugs sam mos pa dang // nga rgyal dag gi sgo nas kyang // ma yengs pa yi sems kyis gzung // bzlas brjod bya zhing bsam gtan 'jug/ bzlas brjod byed pa'i tshe na yang // lha ni mi bsam ma dmigs rung // las sam 'bras bu gang dmigs kyang // spyir na dmigs pa rtse gcig la// 'bad pas mthu dang byin rlabs che// spyir na lha yi de kho na// nyid las 'grub pa'i lha yang 'grub// don dam sems kyi lha dang ni// kun rdzob mtshan ma'i lha nyid la// sems dpa' bye brag lha zhes bya// ming du lhar ni btags pa yin// dam tshig can gyi skye bo'i lha// phyag rgya'i mtshan ma lhar grags pa// btags pas rnam pa du mar 'jug/ rnam par smin pa'i lus dbyibs kyis/ bye brag dpe phyi zhes pa dang // de nyid bdag gi chen po'o// mtshan ma'i gzugs zhes btags pa dang // de nyid skye bo'i byin rlabs sogs// nus mthu can zhes btags pa dang // de nyid rnam par smin pa'i gzugs// bye brag ye shes byin brlabs nyid// dbyer med 'dres nas lha zhes btags// de nyid bdag nyid chen po rnam// thugs ni gsang ba'i ye shes nyid// mtshan ma'i gzugs su sprul pa ste// chu nyid grang ba'i rkyen gyis ni// 'khrugs rom gyur pa lta bu'o// chos rnams lhun gyis grub pa yi// phyag rgya'i rang bzhin yin pa la// las kyi 'phro dang skal ba yi// dbang gis so sor snang ba de// shin tu dag par 'dul gyur rnams// longs spyod rdzogs pa'i skur snang ngo // sems can khengs pa dag la yang // las ni dag par gyur rnams la// sbrul sku rab byung cha lugs snang // de yi 'og ma rnams la ni// cha shas dag gis phyag rgyar snang // de yi 'og ma rnams la ni// thun mong gzugs brnyan la brten pa'i// phyag rgya tha dad snang bas te// thams cad lhun gyis grub pa la// phyag rgya'i bye brag med par 'dod// d</w:t>
-            </w:r>
-          </w:p>
-        </w:tc>
-        <w:tc>
-          <w:tcPr>
-            <w:tcW w:type="dxa" w:w="4320"/>
-          </w:tcPr>
-          <w:p>
-            <w:r>
-              <w:t>gs pa'o/ /rnam pa'ang 'od dang yi ge dang mtshan ma dang sku phra</w:t>
-              <w:br/>
-              <w:t>mo lta bu'i rnam par dmigs pa'o/ /chos la ma rten pa ni bye brag so sor phye ba med</w:t>
-              <w:br/>
-              <w:t>par/ dbugs phyi nang du rgyu ba tsam la dmigs te/ mtshan ma'i rnam pa gang yang</w:t>
-              <w:br/>
-              <w:t>rung ba gcig la dmigs pa'am/ reg bya tsam la dmigs kyang rung ste/ sems ma yengs</w:t>
-              <w:br/>
-              <w:t>par gtad pa 'ba' zhig tsam kyis kyang chog go /spyir grags pa'i kha dog dang bong</w:t>
-              <w:br/>
-              <w:t>tshod kyi skyon dang yon tan ni/ khams rnams ni gdug pa'i mtshan nyid yin</w:t>
-              <w:br/>
-              <w:t>pas/ bsam gtan gyi yul du dmigs pa tsam la'ang mthu brtags pa'i dus na/ skyon dang</w:t>
-              <w:br/>
-              <w:t>yon tan yod de/ de la kha dog dkar po ni gdug pa zhi bar byed pa'i mtshan nyid/ ser</w:t>
-              <w:br/>
-              <w:t>po ni gdug pa 'dzin pa'i mtshan nyid/ dmar po ni gdug pa mched pa'i mtshan</w:t>
-              <w:br/>
-              <w:t>nyid/ nag po ni gdug pa slong ba'i mtshan nyid zhes 'byung / reg bya dang bong</w:t>
-              <w:br/>
-              <w:t>tshod kyang sra zhing sbom pa ltar lus la mi bde ba 'byung / phra zhing dang la chu</w:t>
-              <w:br/>
-              <w:t>zla ltar dngos po'i shas chung bar dmigs na lus la mi bde ba mi 'byung ngo</w:t>
-              <w:br/>
-              <w:t>zhe'o/ /dbugs la dmigs pa'i yon tan ni/ lus kyi rnam pa la mkhas pas gcig pur lta ba</w:t>
-              <w:br/>
-              <w:t>dang / dngos por lta ba dang / bde zhing gtsang bar lta ba rnams ldog ste/ lhag</w:t>
-              <w:br/>
-              <w:t>mthong bskyed do/ /sems gnas pa thob pas zhi gnas las su rung bar 'gyur ro/ /sems la</w:t>
-              <w:br/>
-              <w:t>dmigs pa'ang de bzhin sbyar te/ sems kyi rang bzhin ni snang ba'i khams dang / rlom</w:t>
-              <w:br/>
-              <w:t>sems pa'i khams dang / dngos po so so rnam par rig pa'i khams so/ /sems kyi gnas ni</w:t>
-              <w:br/>
-              <w:t>khams lnga pa'i rlung la zhon nas khams lnga pa'i lus la gnas so/ /sems kyi yul</w:t>
-              <w:br/>
-              <w:t>ni/ snang ba'i yul ni chos thams cad do/ /rlom sems pa'i yul ni sems nyid do/ /rnam</w:t>
-              <w:br/>
-              <w:t>par rig pa'i yul ni phyi'i skye mched rnams so/ /sems kyi lam ni dbang po rnams</w:t>
-              <w:br/>
-              <w:t>so/ /sems kyi las ni gnyis te/ 'dzin pa'i las ni chos thams cad 'dzin par byed do/ /byed</w:t>
-              <w:br/>
-              <w:t>pa'i las ni dkar gnag gi 'du byed thams cad mngon par 'du byed do/ /sems la dmigs</w:t>
-              <w:br/>
-              <w:t>pa'i thabs ni/ gong du dbugs la dmigs pa las su rung bas/ de nas dran pa dang shes</w:t>
-              <w:br/>
-              <w:t>bzhin kyis bzung ste/ sems ji ltar skye ba nyid la dmigs pas sems kyi mtshan nyid</w:t>
-              <w:br/>
-              <w:t>khong du chud par 'gyur ro/ /dmigs pa'i yon tan ni/ bdag du lta ba dang / rtag par lta</w:t>
-              <w:br/>
-              <w:t>ba dang / dngos por lta ba thams cad ldog ste/ lhag mthong skyed do/ /sems las su</w:t>
-              <w:br/>
-              <w:t>rung bar 'gyur te zhi gnas 'thob bo/ /de ltar lus dang sems la dmigs pa las su rung</w:t>
-              <w:br/>
-              <w:t>nas/ lha la dmigs par bya ste/ lha la'ang re zhig gi mtshan ma lus sems dang mthun</w:t>
-              <w:br/>
-              <w:t>par bstan te/ de yang 'di ltar lha'i rang bzhin ni/ chos nyid dag pa dang / rnam par mi</w:t>
-              <w:br/>
-              <w:t>rtog pa'i ye shes dang / ci yang sa le mkhyen pa'i ye shes dang / 'gro ba 'dul ba'i</w:t>
-              <w:br/>
-              <w:t>gzugs kyi sku dang / so so'i skad du dam pa'i chos ston pa'i gsung ste/ chos lnga'i</w:t>
-              <w:br/>
-              <w:t>rang bzhin no/ /lha'i gnas ni/ sems can kyi lus dang sems nyid do/ /lha'i yul ni chos</w:t>
-              <w:br/>
-              <w:t>kyi dbyings dang / thugs rje'i zhing rnams so/ /lha'i lam ni 'gro 'ong mi mnga' 'ang</w:t>
-              <w:br/>
-              <w:t>/ lha'i yongs su gzung ba ni sems can/ sems can kyi skyabs ni lha ste/ 'brel pa gnyis</w:t>
-              <w:br/>
-              <w:t>kyi sgo dang lam du gyur pa ni/ lam gyi chos sems can dang lhar 'brel/  dang lung gi</w:t>
-              <w:br/>
-              <w:t>chos lha dang sems can du 'brel/  so/ /lha'i las ni/ 'dzin pa'i las ni yon tan thams caddang ldan pa'o/ /byed pa'i las ni sems can sgrol bar mdzad pa'o/ /lha la dmigs pa'i</w:t>
-              <w:br/>
-              <w:t>thabs ni lus dang sems nyid lhar bsgoms pa ste/ de yang rnal 'byor rnam pa gsum gyi</w:t>
-              <w:br/>
-              <w:t>tshul kyis/ byin kyis rlob pa'i tshul lam/ yongs su brtags pa'am/ rdzogs pa'i tshul</w:t>
-              <w:br/>
-              <w:t>gang yang rung bar bsgom mo/ /yon tan ni/  tshogs rnam pa gnyis dus gcig du</w:t>
-              <w:br/>
-              <w:t>rdzogs par 'gyur ba'o/ /de ltar dmigs pa rnam pa gsum la rims kyis bslab cing / rims</w:t>
-              <w:br/>
-              <w:t>kyis bstan par bshad pa 'di ni/ byis pa dang po gzhug pa tsam ste/ dngos su ni lus</w:t>
-              <w:br/>
-              <w:t>nyid sems kyi rnam pa yin la/ sems kyi rang bzhin ni lha yin no/ /de bas na phyi nang</w:t>
-              <w:br/>
-              <w:t>snod bcud kyi chos thams cad kyi rang gi ngo bo lha nyid du shes pa ni/ dang po lha</w:t>
-              <w:br/>
-              <w:t>ngo shes pa yin no/ /bar du lha bsgom pa'i thabs shes pa ni/ bsgrub thabs sna tshogs</w:t>
-              <w:br/>
-              <w:t>nas gsungs pa dang / gong du bstan pa'i bsam gtan kyi lung sems lon gyis bcos pa'i</w:t>
-              <w:br/>
-              <w:t>thabs bstan pa rnams yin no/ /tha ma las su rung ba'i tshad bstan pa ni/ mtshan ma</w:t>
-              <w:br/>
-              <w:t>med pa'i lha'i tshad ni gong du bstan zin to/ /mtshan ma'i lha'i sku bsgoms pa'i tshad</w:t>
-              <w:br/>
-              <w:t>ni/ lha'i lung bcur bstan pa'ang yod na/ mdo gsum du 'dus te/ lham me/ lhan</w:t>
-              <w:br/>
-              <w:t>ne/ lhang nge ba dang gsum ste/ de la lham me ni ma brdos pa/ lhan ne ni ma g.yos</w:t>
-              <w:br/>
-              <w:t>pa/ lhang nge ni ma bsgribs pa'o/ /de la ma brdos pa ni snang la rang bzhin med pa</w:t>
-              <w:br/>
-              <w:t>ste/ gzugs brnyan nam chu zla lta bu'o/ /ma g.yos pa ni bying rgod kyi zug rngus ma</w:t>
-              <w:br/>
-              <w:t>bskyod pa ste/ nor bu rin po che'i 'od lta bu'o/ /ma bsgribs pa ni de gnyis dang ldan</w:t>
-              <w:br/>
-              <w:t>pas ma rtogs pa'i sgrib pa dang / mi gsal ba'i sgrib pa gnyis med par shin du gsal bar</w:t>
-              <w:br/>
-              <w:t>snang ba/ dbang pos blta bar mi bzod pa ltar shin tu gsal ba'o/ /de dag ni tshul bzhin</w:t>
-              <w:br/>
-              <w:t>du slob par 'dod pa rnams kyi dbang du bshad pa'o/ /gang dag mos pa dang bya bas</w:t>
-              <w:br/>
-              <w:t>g.yengs par gyur cing tshul bzhin du sbyor mi nus pa rnams kyis ni/ rdzogs pa chen</w:t>
-              <w:br/>
-              <w:t>po'i don dang / lha'i rang bzhin ji ltar ba yid la bya ste/ des zin par byas la/ cho ga'i</w:t>
-              <w:br/>
-              <w:t>rim pas bskyed kyang rung / skad cig gcig la rdzogs pa'i tshul lam/ bag chags kyi</w:t>
-              <w:br/>
-              <w:t>shugs sam/ mos pa dang nga rgyal kyi sgo nas kyang ma yengs pa'i sems kyis bzung</w:t>
-              <w:br/>
-              <w:t>ste/ bzlas brjod dang bsam gtan la 'jug go /bzlas brjod kyi tshe'ang mdun du lha</w:t>
-              <w:br/>
-              <w:t>dmigs kyang rung / ma dmigs kyang rung / 'phro 'du yod kyang rung med kyang</w:t>
-              <w:br/>
-              <w:t>rung / las sam 'bras bu gang la dmigs kyang rung ste/ spyir dmigs pa rtse gcig pas</w:t>
-              <w:br/>
-              <w:t>'bad pa ltar mthu dang byin rlabs che'o/ /spyir lha'i de kho na nyid la/ lha drug du</w:t>
-              <w:br/>
-              <w:t>grags pa dang / don dam pa'i lha chos nyid kyi lha/ dang / sems pa'i bye brag gi lha</w:t>
-              <w:br/>
-              <w:t>gzhan kun/  zhes bya ba dang / lhar btags pa dang / dam tshig can gyi skye bos</w:t>
-              <w:br/>
-              <w:t>brtags pa'i lha zhes spyir grags mod kyi/ phyag rgya'i mtshan ma la lhar grags pa</w:t>
-              <w:br/>
-              <w:t>na/ brtag pa rnam pa du ma la 'jug ste/ rnam par pha rol du phyin pa'i lugs/  smin</w:t>
-              <w:br/>
-              <w:t>pa'i lus kyi dbyibs kyi bye brag ces brtag pa dang / de nyid bdag nyid chen po sngags</w:t>
-              <w:br/>
-              <w:t>kyi lugs/  rnams kyi mtshan ma'i gzugs so zhes brtag pa dang / de nyid skye bo byin</w:t>
-              <w:br/>
-              <w:t>kyis rlob pa la sogs pa'i nus mthu can no zhes brtag pa dang / de nyid dam tshig can</w:t>
-              <w:br/>
-              <w:t>kyi skye bos lhar brtags pa'o zhes brtag pa dang / de nyid rnam par smin pa'i gzugs</w:t>
-              <w:br/>
-              <w:t>kyi bye brag dang / ye shes chen po'i byin rlabs gnyis dbyer med par 'dres pa'o zhes</w:t>
-              <w:br/>
-              <w:t>brtag pa dang de nyid bdag nyid chen po rnams kyi thugs gsang ba'i ye shes nyidmtshan ma'i gzugs su sprul pa ste/ chu grang ba'i rkyen kyis chab rom du gyur pa lta</w:t>
-              <w:br/>
-              <w:t>bu'o zhes brtag pa dang / chos thams cad lhun kyis grub pa'i phyag rgya'i rang bzhin</w:t>
-              <w:br/>
-              <w:t>yin pa las/ las 'phro dang skal ba'i dbang gis so sor snang ste/ de la shin du dag pa dul</w:t>
-              <w:br/>
-              <w:t>bar gyur pa rnams la ni longs spyod rdzogs pa'i skur snang ngo / /sems can khengs pa</w:t>
-              <w:br/>
-              <w:t>las dag par gyur pa rnams la ni/ sprul pa'i sku rab du byung ba'i cha lugs su snang ngo</w:t>
-              <w:br/>
-              <w:t>/ /de'i 'og ma rnams la ni cha shas kyi phyag rgya snang ngo / /de'i 'og ma rnams la ni</w:t>
-              <w:br/>
               <w:t>thun mong gi gzugs la rten pa'i phyag rgya snang ste/ thams cad kyang lhun gyis grub</w:t>
               <w:br/>
-              <w:t>pa'i phyag rgyar bye brag med do zhes 'dod d</w:t>
+              <w:t>pa'i phyag rgyar bye brag med do zhes 'dod do/ /de la</w:t>
             </w:r>
           </w:p>
         </w:tc>

</xml_diff>